<commit_message>
Release v1.7.0 with shared access cards and live AD verification
</commit_message>
<xml_diff>
--- a/docs/Jira-Reminders-KB.docx
+++ b/docs/Jira-Reminders-KB.docx
@@ -148,7 +148,7 @@
               <w:spacing w:after="0"/>
             </w:pPr>
             <w:r>
-              <w:t>1.6.0</w:t>
+              <w:t>1.7.0</w:t>
             </w:r>
           </w:p>
         </w:tc>
@@ -204,7 +204,7 @@
               <w:spacing w:after="0"/>
             </w:pPr>
             <w:r>
-              <w:t>21 August 2026</w:t>
+              <w:t>24 September 2026</w:t>
             </w:r>
           </w:p>
         </w:tc>
@@ -563,7 +563,7 @@
             <w:color w:val="0C66E4"/>
             <w:u w:val="single"/>
           </w:rPr>
-          <w:t>Jira Reminders v1.6.0 release</w:t>
+          <w:t>Jira Reminders v1.7.0 release</w:t>
         </w:r>
       </w:hyperlink>
       <w:r>
@@ -585,7 +585,7 @@
             <w:color w:val="0C66E4"/>
             <w:u w:val="single"/>
           </w:rPr>
-          <w:t>Jira-Reminders-1.6.0.msi</w:t>
+          <w:t>Jira-Reminders-1.7.0.msi</w:t>
         </w:r>
       </w:hyperlink>
       <w:r>
@@ -698,7 +698,7 @@
               <w:t>Unknown publisher:</w:t>
             </w:r>
             <w:r>
-              <w:t xml:space="preserve"> Version 1.6.0 is not Authenticode-signed, so Windows may show an </w:t>
+              <w:t xml:space="preserve"> Version 1.7.0 is not Authenticode-signed, so Windows may show an </w:t>
             </w:r>
             <w:r>
               <w:rPr>
@@ -1817,6 +1817,174 @@
         <w:pStyle w:val="Heading1"/>
       </w:pPr>
       <w:r>
+        <w:t>Joiner AD setup and completion</w:t>
+      </w:r>
+    </w:p>
+    <w:p>
+      <w:r>
+        <w:t xml:space="preserve">Review the plan in </w:t>
+      </w:r>
+      <w:r>
+        <w:rPr>
+          <w:b/>
+        </w:rPr>
+        <w:t>AD Setup</w:t>
+      </w:r>
+      <w:r>
+        <w:t xml:space="preserve"> before applying it with administrator credentials. For new joiners and dual-account rejoiners, populated SuccessFactors title, description, and department are preserved; the selected buddy supplies only missing role fields. Required missing data blocks the run. Single-account rejoiners retain the Jira-role/buddy-department rule.</w:t>
+      </w:r>
+    </w:p>
+    <w:p>
+      <w:r>
+        <w:t>Execution verifies the resulting account on the same domain controller before recording completion. Denied group additions or missing memberships are shown as advisories and require follow-up, but do not block joiner/rejoiner completion. Other failed checks leave setup incomplete. When restoring an old account, reporting links are transferred before the SF duplicate can be deleted.</w:t>
+      </w:r>
+    </w:p>
+    <w:p>
+      <w:r>
+        <w:t xml:space="preserve">Opening a ticket checks its setup against live AD. The app checks again every minute while the ticket is open; </w:t>
+      </w:r>
+      <w:r>
+        <w:rPr>
+          <w:b/>
+        </w:rPr>
+        <w:t>Check AD</w:t>
+      </w:r>
+      <w:r>
+        <w:t xml:space="preserve"> runs an immediate check. A disabled or locked account, changed attributes or mail routing, incomplete password state, or lost reporting links clears the completion checkmark. An unavailable AD connection also clears the checkmark without deleting setup history. Connect to the corporate network/VPN and check again.</w:t>
+      </w:r>
+    </w:p>
+    <w:p>
+      <w:r>
+        <w:t>Older setup evidence is recovered from the local audit log. Previously completed setups can remain complete when available checks pass, but the summary explicitly shows when the old log lacks a full baseline. Review all group advisories and verification limitations before handing the account over.</w:t>
+      </w:r>
+    </w:p>
+    <w:p>
+      <w:pPr>
+        <w:pStyle w:val="Heading1"/>
+      </w:pPr>
+      <w:r>
+        <w:t>Access-card printing</w:t>
+      </w:r>
+    </w:p>
+    <w:p>
+      <w:r>
+        <w:t xml:space="preserve">The </w:t>
+      </w:r>
+      <w:r>
+        <w:rPr>
+          <w:b/>
+        </w:rPr>
+        <w:t>Card printer</w:t>
+      </w:r>
+      <w:r>
+        <w:t xml:space="preserve"> tab appears only when the signed-in Windows operator's own AD Office is recognised as Vilnius, including Girteka Park. Other or unavailable offices keep the tab hidden. Connect to the corporate network/VPN and refresh if the expected tab is missing.</w:t>
+      </w:r>
+    </w:p>
+    <w:p>
+      <w:r>
+        <w:t xml:space="preserve">The registry owner must deploy and acceptance-test the shared workbook flow using the </w:t>
+      </w:r>
+      <w:hyperlink r:id="rId13">
+        <w:r>
+          <w:rPr>
+            <w:color w:val="0C66E4"/>
+            <w:u w:val="single"/>
+          </w:rPr>
+          <w:t>OneDrive sync guide</w:t>
+        </w:r>
+      </w:hyperlink>
+      <w:r>
+        <w:t xml:space="preserve">. Then sync the shared </w:t>
+      </w:r>
+      <w:r>
+        <w:rPr>
+          <w:rFonts w:ascii="Consolas" w:hAnsi="Consolas"/>
+          <w:color w:val="172B4D"/>
+          <w:sz w:val="18"/>
+        </w:rPr>
+        <w:t>AccessCardQueue</w:t>
+      </w:r>
+      <w:r>
+        <w:t xml:space="preserve"> folder to your PC and select it under </w:t>
+      </w:r>
+      <w:r>
+        <w:rPr>
+          <w:b/>
+        </w:rPr>
+        <w:t>Settings → Advanced settings → Choose queue folder…</w:t>
+      </w:r>
+      <w:r>
+        <w:t xml:space="preserve">. It must contain </w:t>
+      </w:r>
+      <w:r>
+        <w:rPr>
+          <w:rFonts w:ascii="Consolas" w:hAnsi="Consolas"/>
+          <w:color w:val="172B4D"/>
+          <w:sz w:val="18"/>
+        </w:rPr>
+        <w:t>Requests</w:t>
+      </w:r>
+      <w:r>
+        <w:t xml:space="preserve">, </w:t>
+      </w:r>
+      <w:r>
+        <w:rPr>
+          <w:rFonts w:ascii="Consolas" w:hAnsi="Consolas"/>
+          <w:color w:val="172B4D"/>
+          <w:sz w:val="18"/>
+        </w:rPr>
+        <w:t>Results</w:t>
+      </w:r>
+      <w:r>
+        <w:t xml:space="preserve">, </w:t>
+      </w:r>
+      <w:r>
+        <w:rPr>
+          <w:rFonts w:ascii="Consolas" w:hAnsi="Consolas"/>
+          <w:color w:val="172B4D"/>
+          <w:sz w:val="18"/>
+        </w:rPr>
+        <w:t>Processed</w:t>
+      </w:r>
+      <w:r>
+        <w:t xml:space="preserve">, and </w:t>
+      </w:r>
+      <w:r>
+        <w:rPr>
+          <w:rFonts w:ascii="Consolas" w:hAnsi="Consolas"/>
+          <w:color w:val="172B4D"/>
+          <w:sz w:val="18"/>
+        </w:rPr>
+        <w:t>Staging</w:t>
+      </w:r>
+      <w:r>
+        <w:t>. This connection uses existing OneDrive sign-in; no additional app registration or Microsoft sign-in is needed. The installer does not deploy the flow.</w:t>
+      </w:r>
+    </w:p>
+    <w:p>
+      <w:r>
+        <w:t>After saving, refresh Jira and choose an assigned joiner or rejoiner in Card printer. The app automatically requests the registry record and checks pending results every 15 seconds. New joiners receive IDs from LT5053 onward; rejoiners reuse one unambiguous historical record without changing Excel. Movers are excluded. The workbook flow is the only card-number allocator.</w:t>
+      </w:r>
+    </w:p>
+    <w:p>
+      <w:r>
+        <w:t xml:space="preserve">The confirmed name and numeric ID fill automatically. Select </w:t>
+      </w:r>
+      <w:r>
+        <w:rPr>
+          <w:b/>
+        </w:rPr>
+        <w:t>Export PNG</w:t>
+      </w:r>
+      <w:r>
+        <w:t xml:space="preserve"> and open the image in your card-printing software. Manual entry is unavailable, and export stays disabled for pending, blocked, or ambiguous results. If a request stays pending, check OneDrive sync and ask the registry owner to inspect the flow run history. Follow the guide's recovery steps for manual-review results.</w:t>
+      </w:r>
+    </w:p>
+    <w:p>
+      <w:pPr>
+        <w:pStyle w:val="Heading1"/>
+      </w:pPr>
+      <w:r>
         <w:t>Supported locations</w:t>
       </w:r>
     </w:p>
@@ -2115,12 +2283,23 @@
         <w:pStyle w:val="ListBullet"/>
       </w:pPr>
       <w:r>
-        <w:t>Each AD setup starts with a freshly generated random password. Completed</w:t>
+        <w:t xml:space="preserve">Each joiner/rejoiner AD setup uses the required fixed password </w:t>
+      </w:r>
+      <w:r>
+        <w:rPr>
+          <w:rFonts w:ascii="Consolas" w:hAnsi="Consolas"/>
+          <w:color w:val="172B4D"/>
+          <w:sz w:val="18"/>
+        </w:rPr>
+        <w:t>Welcome123</w:t>
+      </w:r>
+      <w:r>
+        <w:t>.</w:t>
       </w:r>
     </w:p>
     <w:p>
       <w:r>
-        <w:t xml:space="preserve">handoff passwords are stored in Windows Credential Manager, not in </w:t>
+        <w:t xml:space="preserve">Completed handoff passwords are stored in Windows Credential Manager, not in </w:t>
       </w:r>
       <w:r>
         <w:rPr>
@@ -2169,6 +2348,19 @@
       </w:r>
       <w:r>
         <w:t>.</w:t>
+      </w:r>
+    </w:p>
+    <w:p>
+      <w:pPr>
+        <w:pStyle w:val="ListBullet"/>
+      </w:pPr>
+      <w:r>
+        <w:t>The optional SharePoint-list and HTTP card connections store Microsoft tokens</w:t>
+      </w:r>
+    </w:p>
+    <w:p>
+      <w:r>
+        <w:t>in Windows DPAPI-encrypted caches. The OneDrive connection uses existing sync.</w:t>
       </w:r>
     </w:p>
     <w:p>
@@ -2630,6 +2822,99 @@
               <w:spacing w:after="0"/>
             </w:pPr>
             <w:r>
+              <w:t>A previously completed AD task is unchecked</w:t>
+            </w:r>
+          </w:p>
+        </w:tc>
+        <w:tc>
+          <w:tcPr>
+            <w:tcW w:type="dxa" w:w="5083"/>
+          </w:tcPr>
+          <w:p>
+            <w:pPr>
+              <w:spacing w:after="0"/>
+            </w:pPr>
+            <w:r>
+              <w:t xml:space="preserve">Open the ticket and select </w:t>
+            </w:r>
+            <w:r>
+              <w:rPr>
+                <w:b/>
+              </w:rPr>
+              <w:t>Check AD</w:t>
+            </w:r>
+            <w:r>
+              <w:t xml:space="preserve"> while connected to the corporate network/VPN. Review the live mismatch or unavailable-AD message; saved history is retained.</w:t>
+            </w:r>
+          </w:p>
+        </w:tc>
+      </w:tr>
+      <w:tr>
+        <w:tc>
+          <w:tcPr>
+            <w:tcW w:type="dxa" w:w="5083"/>
+          </w:tcPr>
+          <w:p>
+            <w:pPr>
+              <w:spacing w:after="0"/>
+            </w:pPr>
+            <w:r>
+              <w:t>Card printer is missing</w:t>
+            </w:r>
+          </w:p>
+        </w:tc>
+        <w:tc>
+          <w:tcPr>
+            <w:tcW w:type="dxa" w:w="5083"/>
+          </w:tcPr>
+          <w:p>
+            <w:pPr>
+              <w:spacing w:after="0"/>
+            </w:pPr>
+            <w:r>
+              <w:t>The tab requires the operator's own AD Office to resolve to Vilnius. Reconnect to the corporate network/VPN and refresh.</w:t>
+            </w:r>
+          </w:p>
+        </w:tc>
+      </w:tr>
+      <w:tr>
+        <w:tc>
+          <w:tcPr>
+            <w:tcW w:type="dxa" w:w="5083"/>
+          </w:tcPr>
+          <w:p>
+            <w:pPr>
+              <w:spacing w:after="0"/>
+            </w:pPr>
+            <w:r>
+              <w:t>Card export is disabled</w:t>
+            </w:r>
+          </w:p>
+        </w:tc>
+        <w:tc>
+          <w:tcPr>
+            <w:tcW w:type="dxa" w:w="5083"/>
+          </w:tcPr>
+          <w:p>
+            <w:pPr>
+              <w:spacing w:after="0"/>
+            </w:pPr>
+            <w:r>
+              <w:t>Wait for a matching confirmed registry result. Check OneDrive sync and the flow run history, or ask the registry owner to resolve the displayed manual-review issue.</w:t>
+            </w:r>
+          </w:p>
+        </w:tc>
+      </w:tr>
+      <w:tr>
+        <w:tc>
+          <w:tcPr>
+            <w:tcW w:type="dxa" w:w="5083"/>
+          </w:tcPr>
+          <w:p>
+            <w:pPr>
+              <w:spacing w:after="0"/>
+            </w:pPr>
+            <w:r>
               <w:t>Reinstalling did not show first-time setup</w:t>
             </w:r>
           </w:p>
@@ -2829,7 +3114,7 @@
             <w:color w:val="0C66E4"/>
             <w:u w:val="single"/>
           </w:rPr>
-          <w:t>Jira Reminders v1.6.0 release</w:t>
+          <w:t>Jira Reminders v1.7.0 release</w:t>
         </w:r>
       </w:hyperlink>
     </w:p>
@@ -2837,7 +3122,7 @@
       <w:pPr>
         <w:pStyle w:val="ListBullet"/>
       </w:pPr>
-      <w:hyperlink r:id="rId13">
+      <w:hyperlink r:id="rId14">
         <w:r>
           <w:rPr>
             <w:color w:val="0C66E4"/>

</xml_diff>

<commit_message>
Remove onboarding password from documentation
</commit_message>
<xml_diff>
--- a/docs/Jira-Reminders-KB.docx
+++ b/docs/Jira-Reminders-KB.docx
@@ -2283,18 +2283,7 @@
         <w:pStyle w:val="ListBullet"/>
       </w:pPr>
       <w:r>
-        <w:t xml:space="preserve">Each joiner/rejoiner AD setup uses the required fixed password </w:t>
-      </w:r>
-      <w:r>
-        <w:rPr>
-          <w:rFonts w:ascii="Consolas" w:hAnsi="Consolas"/>
-          <w:color w:val="172B4D"/>
-          <w:sz w:val="18"/>
-        </w:rPr>
-        <w:t>Welcome123</w:t>
-      </w:r>
-      <w:r>
-        <w:t>.</w:t>
+        <w:t>Each joiner/rejoiner AD setup uses the required onboarding password.</w:t>
       </w:r>
     </w:p>
     <w:p>

</xml_diff>

<commit_message>
Release v1.8.0 with clearer AD status and smoother ticket workflows
</commit_message>
<xml_diff>
--- a/docs/Jira-Reminders-KB.docx
+++ b/docs/Jira-Reminders-KB.docx
@@ -148,7 +148,7 @@
               <w:spacing w:after="0"/>
             </w:pPr>
             <w:r>
-              <w:t>1.7.0</w:t>
+              <w:t>1.8.0</w:t>
             </w:r>
           </w:p>
         </w:tc>
@@ -204,7 +204,7 @@
               <w:spacing w:after="0"/>
             </w:pPr>
             <w:r>
-              <w:t>24 September 2026</w:t>
+              <w:t>28 September 2026</w:t>
             </w:r>
           </w:p>
         </w:tc>
@@ -448,6 +448,28 @@
         <w:t>VPN_IT_integracijos</w:t>
       </w:r>
       <w:r>
+        <w:t xml:space="preserve">, </w:t>
+      </w:r>
+      <w:r>
+        <w:rPr>
+          <w:rFonts w:ascii="Consolas" w:hAnsi="Consolas"/>
+          <w:color w:val="172B4D"/>
+          <w:sz w:val="18"/>
+        </w:rPr>
+        <w:t>GrayList_WillGrow Users</w:t>
+      </w:r>
+      <w:r>
+        <w:t xml:space="preserve">, </w:t>
+      </w:r>
+      <w:r>
+        <w:rPr>
+          <w:rFonts w:ascii="Consolas" w:hAnsi="Consolas"/>
+          <w:color w:val="172B4D"/>
+          <w:sz w:val="18"/>
+        </w:rPr>
+        <w:t>Driver Hiring Manager</w:t>
+      </w:r>
+      <w:r>
         <w:t xml:space="preserve">, and </w:t>
       </w:r>
       <w:r>
@@ -456,7 +478,7 @@
           <w:color w:val="172B4D"/>
           <w:sz w:val="18"/>
         </w:rPr>
-        <w:t>GrayList_WillGrow Users</w:t>
+        <w:t>Driver Hiring Admin</w:t>
       </w:r>
       <w:r>
         <w:t>—are excluded from automatic copying and remain a manual follow-up. If AD denies another group addition or removal, the mover workflow continues applying the remaining safe changes, reports every failed membership in the execution output, and does not record the move as complete.</w:t>
@@ -563,7 +585,7 @@
             <w:color w:val="0C66E4"/>
             <w:u w:val="single"/>
           </w:rPr>
-          <w:t>Jira Reminders v1.7.0 release</w:t>
+          <w:t>Jira Reminders v1.8.0 release</w:t>
         </w:r>
       </w:hyperlink>
       <w:r>
@@ -585,7 +607,7 @@
             <w:color w:val="0C66E4"/>
             <w:u w:val="single"/>
           </w:rPr>
-          <w:t>Jira-Reminders-1.7.0.msi</w:t>
+          <w:t>Jira-Reminders-1.8.0.msi</w:t>
         </w:r>
       </w:hyperlink>
       <w:r>
@@ -698,7 +720,7 @@
               <w:t>Unknown publisher:</w:t>
             </w:r>
             <w:r>
-              <w:t xml:space="preserve"> Version 1.7.0 is not Authenticode-signed, so Windows may show an </w:t>
+              <w:t xml:space="preserve"> Version 1.8.0 is not Authenticode-signed, so Windows may show an </w:t>
             </w:r>
             <w:r>
               <w:rPr>
@@ -1440,7 +1462,30 @@
         <w:pStyle w:val="ListNumber"/>
       </w:pPr>
       <w:r>
-        <w:t>Confirm the window shows onboarding tickets assigned to you.</w:t>
+        <w:t xml:space="preserve">Confirm the </w:t>
+      </w:r>
+      <w:r>
+        <w:rPr>
+          <w:b/>
+        </w:rPr>
+        <w:t>New joiners</w:t>
+      </w:r>
+      <w:r>
+        <w:t xml:space="preserve"> and </w:t>
+      </w:r>
+      <w:r>
+        <w:rPr>
+          <w:b/>
+        </w:rPr>
+        <w:t>Movers</w:t>
+      </w:r>
+      <w:r>
+        <w:t xml:space="preserve"> tabs are visible and show tickets</w:t>
+      </w:r>
+    </w:p>
+    <w:p>
+      <w:r>
+        <w:t>assigned to you.</w:t>
       </w:r>
     </w:p>
     <w:p>
@@ -1814,6 +1859,79 @@
     </w:p>
     <w:p>
       <w:pPr>
+        <w:pStyle w:val="Heading2"/>
+      </w:pPr>
+      <w:r>
+        <w:t>Ticket navigation and checklist</w:t>
+      </w:r>
+    </w:p>
+    <w:p>
+      <w:r>
+        <w:t xml:space="preserve">Use </w:t>
+      </w:r>
+      <w:r>
+        <w:rPr>
+          <w:b/>
+        </w:rPr>
+        <w:t>New joiners</w:t>
+      </w:r>
+      <w:r>
+        <w:t xml:space="preserve"> for onboarding and </w:t>
+      </w:r>
+      <w:r>
+        <w:rPr>
+          <w:b/>
+        </w:rPr>
+        <w:t>Movers</w:t>
+      </w:r>
+      <w:r>
+        <w:t xml:space="preserve"> for employee moves. Background refreshes keep the selected ticket, notes, and scroll position when the displayed information has not changed. Scroll with the mouse wheel or touchpad; a nested text area hands scrolling to the surrounding page at its boundary.</w:t>
+      </w:r>
+    </w:p>
+    <w:p>
+      <w:r>
+        <w:t>The onboarding checklist contains:</w:t>
+      </w:r>
+    </w:p>
+    <w:p>
+      <w:pPr>
+        <w:pStyle w:val="ListNumber"/>
+      </w:pPr>
+      <w:r>
+        <w:t>Active Directory account setup</w:t>
+      </w:r>
+    </w:p>
+    <w:p>
+      <w:pPr>
+        <w:pStyle w:val="ListNumber"/>
+      </w:pPr>
+      <w:r>
+        <w:t>Axapta account import/creation</w:t>
+      </w:r>
+    </w:p>
+    <w:p>
+      <w:pPr>
+        <w:pStyle w:val="ListNumber"/>
+      </w:pPr>
+      <w:r>
+        <w:t>AX user relations assignment</w:t>
+      </w:r>
+    </w:p>
+    <w:p>
+      <w:pPr>
+        <w:pStyle w:val="ListNumber"/>
+      </w:pPr>
+      <w:r>
+        <w:t>Assign hardware &amp; licenses in Snipe-IT</w:t>
+      </w:r>
+    </w:p>
+    <w:p>
+      <w:r>
+        <w:t>Existing completion state for these tasks is retained during upgrade. The AD checkmark follows setup verification; complete the other items as their work is done.</w:t>
+      </w:r>
+    </w:p>
+    <w:p>
+      <w:pPr>
         <w:pStyle w:val="Heading1"/>
       </w:pPr>
       <w:r>
@@ -1860,10 +1978,10 @@
     </w:p>
     <w:p>
       <w:pPr>
-        <w:pStyle w:val="Heading1"/>
+        <w:pStyle w:val="Heading2"/>
       </w:pPr>
       <w:r>
-        <w:t>Access-card printing</w:t>
+        <w:t>Read the verification pane</w:t>
       </w:r>
     </w:p>
     <w:p>
@@ -1874,110 +1992,243 @@
         <w:rPr>
           <w:b/>
         </w:rPr>
-        <w:t>Card printer</w:t>
+        <w:t>Account</w:t>
       </w:r>
       <w:r>
-        <w:t xml:space="preserve"> tab appears only when the signed-in Windows operator's own AD Office is recognised as Vilnius, including Girteka Park. Other or unavailable offices keep the tab hidden. Connect to the corporate network/VPN and refresh if the expected tab is missing.</w:t>
+        <w:t xml:space="preserve"> row beneath Username shows the enabled state from the latest AD result:</w:t>
       </w:r>
+    </w:p>
+    <w:tbl>
+      <w:tblPr>
+        <w:tblStyle w:val="TableGrid"/>
+        <w:tblW w:type="auto" w:w="0"/>
+        <w:tblLayout w:type="autofit"/>
+        <w:tblLook w:firstColumn="1" w:firstRow="1" w:lastColumn="0" w:lastRow="0" w:noHBand="0" w:noVBand="1" w:val="04A0"/>
+      </w:tblPr>
+      <w:tblGrid>
+        <w:gridCol w:w="5083"/>
+        <w:gridCol w:w="5083"/>
+      </w:tblGrid>
+      <w:tr>
+        <w:tc>
+          <w:tcPr>
+            <w:tcW w:type="dxa" w:w="5083"/>
+            <w:shd w:fill="DEEBFF"/>
+          </w:tcPr>
+          <w:p>
+            <w:pPr>
+              <w:spacing w:after="0"/>
+            </w:pPr>
+            <w:r>
+              <w:rPr>
+                <w:b/>
+              </w:rPr>
+              <w:t>Account text</w:t>
+            </w:r>
+          </w:p>
+        </w:tc>
+        <w:tc>
+          <w:tcPr>
+            <w:tcW w:type="dxa" w:w="5083"/>
+            <w:shd w:fill="DEEBFF"/>
+          </w:tcPr>
+          <w:p>
+            <w:pPr>
+              <w:spacing w:after="0"/>
+            </w:pPr>
+            <w:r>
+              <w:rPr>
+                <w:b/>
+              </w:rPr>
+              <w:t>Meaning</w:t>
+            </w:r>
+          </w:p>
+        </w:tc>
+      </w:tr>
+      <w:tr>
+        <w:tc>
+          <w:tcPr>
+            <w:tcW w:type="dxa" w:w="5083"/>
+          </w:tcPr>
+          <w:p>
+            <w:pPr>
+              <w:spacing w:after="0"/>
+            </w:pPr>
+            <w:r>
+              <w:rPr>
+                <w:b/>
+              </w:rPr>
+              <w:t>Enabled</w:t>
+            </w:r>
+            <w:r>
+              <w:t>, green</w:t>
+            </w:r>
+          </w:p>
+        </w:tc>
+        <w:tc>
+          <w:tcPr>
+            <w:tcW w:type="dxa" w:w="5083"/>
+          </w:tcPr>
+          <w:p>
+            <w:pPr>
+              <w:spacing w:after="0"/>
+            </w:pPr>
+            <w:r>
+              <w:t>AD reported that the account is enabled.</w:t>
+            </w:r>
+          </w:p>
+        </w:tc>
+      </w:tr>
+      <w:tr>
+        <w:tc>
+          <w:tcPr>
+            <w:tcW w:type="dxa" w:w="5083"/>
+          </w:tcPr>
+          <w:p>
+            <w:pPr>
+              <w:spacing w:after="0"/>
+            </w:pPr>
+            <w:r>
+              <w:rPr>
+                <w:b/>
+              </w:rPr>
+              <w:t>Disabled</w:t>
+            </w:r>
+            <w:r>
+              <w:t>, red</w:t>
+            </w:r>
+          </w:p>
+        </w:tc>
+        <w:tc>
+          <w:tcPr>
+            <w:tcW w:type="dxa" w:w="5083"/>
+          </w:tcPr>
+          <w:p>
+            <w:pPr>
+              <w:spacing w:after="0"/>
+            </w:pPr>
+            <w:r>
+              <w:t>AD reported that the account is disabled.</w:t>
+            </w:r>
+          </w:p>
+        </w:tc>
+      </w:tr>
+      <w:tr>
+        <w:tc>
+          <w:tcPr>
+            <w:tcW w:type="dxa" w:w="5083"/>
+          </w:tcPr>
+          <w:p>
+            <w:pPr>
+              <w:spacing w:after="0"/>
+            </w:pPr>
+            <w:r>
+              <w:rPr>
+                <w:b/>
+              </w:rPr>
+              <w:t>Unknown</w:t>
+            </w:r>
+            <w:r>
+              <w:t>, gray</w:t>
+            </w:r>
+          </w:p>
+        </w:tc>
+        <w:tc>
+          <w:tcPr>
+            <w:tcW w:type="dxa" w:w="5083"/>
+          </w:tcPr>
+          <w:p>
+            <w:pPr>
+              <w:spacing w:after="0"/>
+            </w:pPr>
+            <w:r>
+              <w:t xml:space="preserve">No enabled-state result is available. Connect to the corporate network/VPN and use </w:t>
+            </w:r>
+            <w:r>
+              <w:rPr>
+                <w:b/>
+              </w:rPr>
+              <w:t>Check AD</w:t>
+            </w:r>
+            <w:r>
+              <w:t>.</w:t>
+            </w:r>
+          </w:p>
+        </w:tc>
+      </w:tr>
+    </w:tbl>
+    <w:p>
+      <w:pPr>
+        <w:spacing w:after="0"/>
+      </w:pPr>
     </w:p>
     <w:p>
       <w:r>
-        <w:t xml:space="preserve">The registry owner must deploy and acceptance-test the shared workbook flow using the </w:t>
-      </w:r>
-      <w:hyperlink r:id="rId13">
-        <w:r>
-          <w:rPr>
-            <w:color w:val="0C66E4"/>
-            <w:u w:val="single"/>
-          </w:rPr>
-          <w:t>OneDrive sync guide</w:t>
-        </w:r>
-      </w:hyperlink>
-      <w:r>
-        <w:t xml:space="preserve">. Then sync the shared </w:t>
-      </w:r>
-      <w:r>
-        <w:rPr>
-          <w:rFonts w:ascii="Consolas" w:hAnsi="Consolas"/>
-          <w:color w:val="172B4D"/>
-          <w:sz w:val="18"/>
-        </w:rPr>
-        <w:t>AccessCardQueue</w:t>
-      </w:r>
-      <w:r>
-        <w:t xml:space="preserve"> folder to your PC and select it under </w:t>
+        <w:t xml:space="preserve">The heading reports overall setup verification. An </w:t>
       </w:r>
       <w:r>
         <w:rPr>
           <w:b/>
         </w:rPr>
-        <w:t>Settings → Advanced settings → Choose queue folder…</w:t>
+        <w:t>Enabled</w:t>
       </w:r>
       <w:r>
-        <w:t xml:space="preserve">. It must contain </w:t>
+        <w:t xml:space="preserve"> account can still need attention for its attributes, mail routing, or other setup checks. A saved confirmation of work completed on another computer is labelled </w:t>
       </w:r>
       <w:r>
         <w:rPr>
-          <w:rFonts w:ascii="Consolas" w:hAnsi="Consolas"/>
-          <w:color w:val="172B4D"/>
-          <w:sz w:val="18"/>
+          <w:b/>
         </w:rPr>
-        <w:t>Requests</w:t>
+        <w:t>AD completed externally — user confirmed</w:t>
+      </w:r>
+      <w:r>
+        <w:t xml:space="preserve"> and does not claim a live verification result.</w:t>
+      </w:r>
+    </w:p>
+    <w:p>
+      <w:r>
+        <w:t xml:space="preserve">Use </w:t>
+      </w:r>
+      <w:r>
+        <w:rPr>
+          <w:b/>
+        </w:rPr>
+        <w:t>Copy username</w:t>
       </w:r>
       <w:r>
         <w:t xml:space="preserve">, </w:t>
       </w:r>
       <w:r>
         <w:rPr>
-          <w:rFonts w:ascii="Consolas" w:hAnsi="Consolas"/>
-          <w:color w:val="172B4D"/>
-          <w:sz w:val="18"/>
+          <w:b/>
         </w:rPr>
-        <w:t>Results</w:t>
-      </w:r>
-      <w:r>
-        <w:t xml:space="preserve">, </w:t>
-      </w:r>
-      <w:r>
-        <w:rPr>
-          <w:rFonts w:ascii="Consolas" w:hAnsi="Consolas"/>
-          <w:color w:val="172B4D"/>
-          <w:sz w:val="18"/>
-        </w:rPr>
-        <w:t>Processed</w:t>
+        <w:t>Copy password</w:t>
       </w:r>
       <w:r>
         <w:t xml:space="preserve">, and </w:t>
       </w:r>
       <w:r>
         <w:rPr>
-          <w:rFonts w:ascii="Consolas" w:hAnsi="Consolas"/>
-          <w:color w:val="172B4D"/>
-          <w:sz w:val="18"/>
+          <w:b/>
         </w:rPr>
-        <w:t>Staging</w:t>
+        <w:t>Copy phone</w:t>
       </w:r>
       <w:r>
-        <w:t>. This connection uses existing OneDrive sign-in; no additional app registration or Microsoft sign-in is needed. The installer does not deploy the flow.</w:t>
-      </w:r>
-    </w:p>
-    <w:p>
-      <w:r>
-        <w:t>After saving, refresh Jira and choose an assigned joiner or rejoiner in Card printer. The app automatically requests the registry record and checks pending results every 15 seconds. New joiners receive IDs from LT5053 onward; rejoiners reuse one unambiguous historical record without changing Excel. Movers are excluded. The workbook flow is the only card-number allocator.</w:t>
-      </w:r>
-    </w:p>
-    <w:p>
-      <w:r>
-        <w:t xml:space="preserve">The confirmed name and numeric ID fill automatically. Select </w:t>
+        <w:t xml:space="preserve"> to copy individual values. </w:t>
       </w:r>
       <w:r>
         <w:rPr>
           <w:b/>
         </w:rPr>
-        <w:t>Export PNG</w:t>
+        <w:t>Copy message</w:t>
       </w:r>
       <w:r>
-        <w:t xml:space="preserve"> and open the image in your card-printing software. Manual entry is unavailable, and export stays disabled for pending, blocked, or ambiguous results. If a request stays pending, check OneDrive sync and ask the registry owner to inspect the flow run history. Follow the guide's recovery steps for manual-review results.</w:t>
+        <w:t xml:space="preserve"> copies a greeting with the current username and no password. If no password is stored on this computer, the pane says so and hides its copy button. Sensitive clipboard copies clear automatically after 30 seconds.</w:t>
+      </w:r>
+    </w:p>
+    <w:p>
+      <w:r>
+        <w:t>Verified summaries show the group count and current OU returned by AD when available. Failed or limited checks retain their diagnostic messages below the account details.</w:t>
       </w:r>
     </w:p>
     <w:p>
@@ -2344,19 +2595,6 @@
         <w:pStyle w:val="ListBullet"/>
       </w:pPr>
       <w:r>
-        <w:t>The optional SharePoint-list and HTTP card connections store Microsoft tokens</w:t>
-      </w:r>
-    </w:p>
-    <w:p>
-      <w:r>
-        <w:t>in Windows DPAPI-encrypted caches. The OneDrive connection uses existing sync.</w:t>
-      </w:r>
-    </w:p>
-    <w:p>
-      <w:pPr>
-        <w:pStyle w:val="ListBullet"/>
-      </w:pPr>
-      <w:r>
         <w:t>Uninstalling the app keeps this personal data so it is available after a</w:t>
       </w:r>
     </w:p>
@@ -2396,7 +2634,7 @@
         <w:pStyle w:val="ListNumber"/>
       </w:pPr>
       <w:r>
-        <w:t xml:space="preserve">Select </w:t>
+        <w:t xml:space="preserve">Save your current work, then select </w:t>
       </w:r>
       <w:r>
         <w:rPr>
@@ -2435,7 +2673,16 @@
         <w:t>Check for updates</w:t>
       </w:r>
       <w:r>
-        <w:t>.</w:t>
+        <w:t xml:space="preserve">, or run the current MSI from the release link above. Existing settings, notes, and completion state for the four current tasks are retained. After upgrading, reopen a joiner ticket and use </w:t>
+      </w:r>
+      <w:r>
+        <w:rPr>
+          <w:b/>
+        </w:rPr>
+        <w:t>Check AD</w:t>
+      </w:r>
+      <w:r>
+        <w:t xml:space="preserve"> to refresh its verification result.</w:t>
       </w:r>
     </w:p>
     <w:p>
@@ -2848,62 +3095,6 @@
               <w:spacing w:after="0"/>
             </w:pPr>
             <w:r>
-              <w:t>Card printer is missing</w:t>
-            </w:r>
-          </w:p>
-        </w:tc>
-        <w:tc>
-          <w:tcPr>
-            <w:tcW w:type="dxa" w:w="5083"/>
-          </w:tcPr>
-          <w:p>
-            <w:pPr>
-              <w:spacing w:after="0"/>
-            </w:pPr>
-            <w:r>
-              <w:t>The tab requires the operator's own AD Office to resolve to Vilnius. Reconnect to the corporate network/VPN and refresh.</w:t>
-            </w:r>
-          </w:p>
-        </w:tc>
-      </w:tr>
-      <w:tr>
-        <w:tc>
-          <w:tcPr>
-            <w:tcW w:type="dxa" w:w="5083"/>
-          </w:tcPr>
-          <w:p>
-            <w:pPr>
-              <w:spacing w:after="0"/>
-            </w:pPr>
-            <w:r>
-              <w:t>Card export is disabled</w:t>
-            </w:r>
-          </w:p>
-        </w:tc>
-        <w:tc>
-          <w:tcPr>
-            <w:tcW w:type="dxa" w:w="5083"/>
-          </w:tcPr>
-          <w:p>
-            <w:pPr>
-              <w:spacing w:after="0"/>
-            </w:pPr>
-            <w:r>
-              <w:t>Wait for a matching confirmed registry result. Check OneDrive sync and the flow run history, or ask the registry owner to resolve the displayed manual-review issue.</w:t>
-            </w:r>
-          </w:p>
-        </w:tc>
-      </w:tr>
-      <w:tr>
-        <w:tc>
-          <w:tcPr>
-            <w:tcW w:type="dxa" w:w="5083"/>
-          </w:tcPr>
-          <w:p>
-            <w:pPr>
-              <w:spacing w:after="0"/>
-            </w:pPr>
-            <w:r>
               <w:t>Reinstalling did not show first-time setup</w:t>
             </w:r>
           </w:p>
@@ -3103,7 +3294,7 @@
             <w:color w:val="0C66E4"/>
             <w:u w:val="single"/>
           </w:rPr>
-          <w:t>Jira Reminders v1.7.0 release</w:t>
+          <w:t>Jira Reminders v1.8.0 release</w:t>
         </w:r>
       </w:hyperlink>
     </w:p>
@@ -3111,7 +3302,7 @@
       <w:pPr>
         <w:pStyle w:val="ListBullet"/>
       </w:pPr>
-      <w:hyperlink r:id="rId14">
+      <w:hyperlink r:id="rId13">
         <w:r>
           <w:rPr>
             <w:color w:val="0C66E4"/>

</xml_diff>